<commit_message>
feat: completely remove academic dossier card and checklist from contact.html
</commit_message>
<xml_diff>
--- a/Project_1_Web_Programming_Salman_Report.docx
+++ b/Project_1_Web_Programming_Salman_Report.docx
@@ -3305,7 +3305,7 @@
       <w:r>
         <w:drawing>
           <wp:inline xmlns:a="http://schemas.openxmlformats.org/drawingml/2006/main" xmlns:pic="http://schemas.openxmlformats.org/drawingml/2006/picture">
-            <wp:extent cx="5669280" cy="8314944"/>
+            <wp:extent cx="5669280" cy="8157464"/>
             <wp:docPr id="6" name="Picture 6"/>
             <wp:cNvGraphicFramePr>
               <a:graphicFrameLocks noChangeAspect="1"/>
@@ -3326,7 +3326,7 @@
                   <pic:spPr>
                     <a:xfrm>
                       <a:off x="0" y="0"/>
-                      <a:ext cx="5669280" cy="8314944"/>
+                      <a:ext cx="5669280" cy="8157464"/>
                     </a:xfrm>
                     <a:prstGeom prst="rect"/>
                   </pic:spPr>

</xml_diff>